<commit_message>
Fixes to application status / tracking screen views
</commit_message>
<xml_diff>
--- a/03_Team_Work/Team1/Milestone_3_Components/1_In_Progress/DC_M3_Team1_ApplicationStatusTrackingView_v1.0.docx
+++ b/03_Team_Work/Team1/Milestone_3_Components/1_In_Progress/DC_M3_Team1_ApplicationStatusTrackingView_v1.0.docx
@@ -61,13 +61,15 @@
       <w:r>
         <w:rPr>
           <w:rFonts w:ascii="Arial" w:eastAsia="Times New Roman" w:hAnsi="Arial" w:cs="Arial"/>
+          <w:b/>
+          <w:bCs/>
           <w:lang w:eastAsia="en-US"/>
         </w:rPr>
         <w:drawing>
-          <wp:inline distT="0" distB="0" distL="0" distR="0" wp14:anchorId="1E04A673" wp14:editId="646BBD0F">
-            <wp:extent cx="5943600" cy="4480560"/>
-            <wp:effectExtent l="0" t="0" r="0" b="0"/>
-            <wp:docPr id="783371324" name="Picture 1"/>
+          <wp:inline distT="0" distB="0" distL="0" distR="0" wp14:anchorId="5BAE6756" wp14:editId="4CBF47ED">
+            <wp:extent cx="5458587" cy="6563641"/>
+            <wp:effectExtent l="0" t="0" r="8890" b="8890"/>
+            <wp:docPr id="1300888606" name="Picture 1"/>
             <wp:cNvGraphicFramePr>
               <a:graphicFrameLocks xmlns:a="http://schemas.openxmlformats.org/drawingml/2006/main" noChangeAspect="1"/>
             </wp:cNvGraphicFramePr>
@@ -75,7 +77,7 @@
               <a:graphicData uri="http://schemas.openxmlformats.org/drawingml/2006/picture">
                 <pic:pic xmlns:pic="http://schemas.openxmlformats.org/drawingml/2006/picture">
                   <pic:nvPicPr>
-                    <pic:cNvPr id="783371324" name=""/>
+                    <pic:cNvPr id="1300888606" name=""/>
                     <pic:cNvPicPr/>
                   </pic:nvPicPr>
                   <pic:blipFill>
@@ -87,7 +89,7 @@
                   <pic:spPr>
                     <a:xfrm>
                       <a:off x="0" y="0"/>
-                      <a:ext cx="5943600" cy="4480560"/>
+                      <a:ext cx="5458587" cy="6563641"/>
                     </a:xfrm>
                     <a:prstGeom prst="rect">
                       <a:avLst/>
@@ -99,72 +101,6 @@
           </wp:inline>
         </w:drawing>
       </w:r>
-    </w:p>
-    <w:p>
-      <w:pPr>
-        <w:spacing w:before="240"/>
-        <w:rPr>
-          <w:rFonts w:ascii="Arial" w:eastAsia="Times New Roman" w:hAnsi="Arial" w:cs="Arial"/>
-          <w:b/>
-          <w:bCs/>
-          <w:lang w:eastAsia="en-US"/>
-        </w:rPr>
-      </w:pPr>
-    </w:p>
-    <w:p>
-      <w:pPr>
-        <w:spacing w:before="240"/>
-        <w:rPr>
-          <w:rFonts w:ascii="Arial" w:eastAsia="Times New Roman" w:hAnsi="Arial" w:cs="Arial"/>
-          <w:b/>
-          <w:bCs/>
-          <w:lang w:eastAsia="en-US"/>
-        </w:rPr>
-      </w:pPr>
-    </w:p>
-    <w:p>
-      <w:pPr>
-        <w:spacing w:before="240"/>
-        <w:rPr>
-          <w:rFonts w:ascii="Arial" w:eastAsia="Times New Roman" w:hAnsi="Arial" w:cs="Arial"/>
-          <w:b/>
-          <w:bCs/>
-          <w:lang w:eastAsia="en-US"/>
-        </w:rPr>
-      </w:pPr>
-    </w:p>
-    <w:p>
-      <w:pPr>
-        <w:spacing w:before="240"/>
-        <w:rPr>
-          <w:rFonts w:ascii="Arial" w:eastAsia="Times New Roman" w:hAnsi="Arial" w:cs="Arial"/>
-          <w:b/>
-          <w:bCs/>
-          <w:lang w:eastAsia="en-US"/>
-        </w:rPr>
-      </w:pPr>
-    </w:p>
-    <w:p>
-      <w:pPr>
-        <w:spacing w:before="240"/>
-        <w:rPr>
-          <w:rFonts w:ascii="Arial" w:eastAsia="Times New Roman" w:hAnsi="Arial" w:cs="Arial"/>
-          <w:b/>
-          <w:bCs/>
-          <w:lang w:eastAsia="en-US"/>
-        </w:rPr>
-      </w:pPr>
-    </w:p>
-    <w:p>
-      <w:pPr>
-        <w:spacing w:before="240"/>
-        <w:rPr>
-          <w:rFonts w:ascii="Arial" w:eastAsia="Times New Roman" w:hAnsi="Arial" w:cs="Arial"/>
-          <w:b/>
-          <w:bCs/>
-          <w:lang w:eastAsia="en-US"/>
-        </w:rPr>
-      </w:pPr>
     </w:p>
     <w:p>
       <w:pPr>
@@ -218,11 +154,14 @@
         </w:rPr>
       </w:pPr>
       <w:r>
+        <w:rPr>
+          <w:noProof/>
+        </w:rPr>
         <w:drawing>
-          <wp:inline distT="0" distB="0" distL="0" distR="0" wp14:anchorId="7BF781C1" wp14:editId="6139B3BC">
-            <wp:extent cx="2553056" cy="4105848"/>
-            <wp:effectExtent l="0" t="0" r="0" b="9525"/>
-            <wp:docPr id="1024671986" name="Picture 1"/>
+          <wp:inline distT="0" distB="0" distL="0" distR="0" wp14:anchorId="512D8BC4" wp14:editId="5E8037C4">
+            <wp:extent cx="2358549" cy="5842000"/>
+            <wp:effectExtent l="0" t="0" r="3810" b="6350"/>
+            <wp:docPr id="2071695465" name="Picture 2"/>
             <wp:cNvGraphicFramePr>
               <a:graphicFrameLocks xmlns:a="http://schemas.openxmlformats.org/drawingml/2006/main" noChangeAspect="1"/>
             </wp:cNvGraphicFramePr>
@@ -230,23 +169,36 @@
               <a:graphicData uri="http://schemas.openxmlformats.org/drawingml/2006/picture">
                 <pic:pic xmlns:pic="http://schemas.openxmlformats.org/drawingml/2006/picture">
                   <pic:nvPicPr>
-                    <pic:cNvPr id="1024671986" name=""/>
-                    <pic:cNvPicPr/>
+                    <pic:cNvPr id="0" name="Picture 2"/>
+                    <pic:cNvPicPr>
+                      <a:picLocks noChangeAspect="1" noChangeArrowheads="1"/>
+                    </pic:cNvPicPr>
                   </pic:nvPicPr>
                   <pic:blipFill>
-                    <a:blip r:embed="rId5"/>
+                    <a:blip r:embed="rId5">
+                      <a:extLst>
+                        <a:ext uri="{28A0092B-C50C-407E-A947-70E740481C1C}">
+                          <a14:useLocalDpi xmlns:a14="http://schemas.microsoft.com/office/drawing/2010/main" val="0"/>
+                        </a:ext>
+                      </a:extLst>
+                    </a:blip>
+                    <a:srcRect/>
                     <a:stretch>
                       <a:fillRect/>
                     </a:stretch>
                   </pic:blipFill>
-                  <pic:spPr>
+                  <pic:spPr bwMode="auto">
                     <a:xfrm>
                       <a:off x="0" y="0"/>
-                      <a:ext cx="2553056" cy="4105848"/>
+                      <a:ext cx="2363766" cy="5854923"/>
                     </a:xfrm>
                     <a:prstGeom prst="rect">
                       <a:avLst/>
                     </a:prstGeom>
+                    <a:noFill/>
+                    <a:ln>
+                      <a:noFill/>
+                    </a:ln>
                   </pic:spPr>
                 </pic:pic>
               </a:graphicData>
@@ -330,7 +282,6 @@
             <w:r>
               <w:rPr>
                 <w:rFonts w:ascii="Arial" w:eastAsia="Times New Roman" w:hAnsi="Arial" w:cs="Arial"/>
-                <w:color w:val="FFFFFF" w:themeColor="background1"/>
                 <w:lang w:eastAsia="en-US"/>
               </w:rPr>
               <w:t>Field</w:t>
@@ -360,8 +311,6 @@
             <w:r>
               <w:rPr>
                 <w:rFonts w:ascii="Arial" w:eastAsia="Times New Roman" w:hAnsi="Arial" w:cs="Arial"/>
-                <w:color w:val="FFFFFF" w:themeColor="background1"/>
-                <w:szCs w:val="22"/>
                 <w:lang w:eastAsia="en-US"/>
               </w:rPr>
               <w:t>Description / Purpose</w:t>
@@ -391,7 +340,6 @@
               <w:rPr>
                 <w:rFonts w:ascii="Arial" w:eastAsia="Times New Roman" w:hAnsi="Arial" w:cs="Arial"/>
                 <w:sz w:val="22"/>
-                <w:szCs w:val="22"/>
                 <w:lang w:eastAsia="en-US"/>
               </w:rPr>
               <w:t>View Name &amp; Number</w:t>
@@ -416,7 +364,6 @@
               <w:rPr>
                 <w:rFonts w:ascii="Arial" w:eastAsia="Times New Roman" w:hAnsi="Arial" w:cs="Arial"/>
                 <w:sz w:val="22"/>
-                <w:szCs w:val="22"/>
                 <w:lang w:eastAsia="en-US"/>
               </w:rPr>
               <w:t>2.6 – Application Status Tracking Screen</w:t>
@@ -443,7 +390,6 @@
               <w:rPr>
                 <w:rFonts w:ascii="Arial" w:eastAsia="Times New Roman" w:hAnsi="Arial" w:cs="Arial"/>
                 <w:sz w:val="22"/>
-                <w:szCs w:val="22"/>
                 <w:lang w:eastAsia="en-US"/>
               </w:rPr>
               <w:t>Purpose / Design Concern</w:t>
@@ -469,7 +415,6 @@
               <w:rPr>
                 <w:rFonts w:ascii="Arial" w:eastAsia="Times New Roman" w:hAnsi="Arial" w:cs="Arial"/>
                 <w:sz w:val="22"/>
-                <w:szCs w:val="22"/>
                 <w:lang w:eastAsia="en-US"/>
               </w:rPr>
               <w:t>Allows</w:t>
@@ -479,7 +424,6 @@
               <w:rPr>
                 <w:rFonts w:ascii="Arial" w:eastAsia="Times New Roman" w:hAnsi="Arial" w:cs="Arial"/>
                 <w:sz w:val="22"/>
-                <w:szCs w:val="22"/>
                 <w:lang w:eastAsia="en-US"/>
               </w:rPr>
               <w:t xml:space="preserve"> students to view the status of their job applications.</w:t>
@@ -509,7 +453,6 @@
               <w:rPr>
                 <w:rFonts w:ascii="Arial" w:eastAsia="Times New Roman" w:hAnsi="Arial" w:cs="Arial"/>
                 <w:sz w:val="22"/>
-                <w:szCs w:val="22"/>
                 <w:lang w:eastAsia="en-US"/>
               </w:rPr>
               <w:t>Description</w:t>
@@ -534,7 +477,6 @@
               <w:rPr>
                 <w:rFonts w:ascii="Arial" w:eastAsia="Times New Roman" w:hAnsi="Arial" w:cs="Arial"/>
                 <w:sz w:val="22"/>
-                <w:szCs w:val="22"/>
                 <w:lang w:eastAsia="en-US"/>
               </w:rPr>
               <w:t xml:space="preserve">Displays applications students have submitted and their </w:t>
@@ -544,7 +486,6 @@
               <w:rPr>
                 <w:rFonts w:ascii="Arial" w:eastAsia="Times New Roman" w:hAnsi="Arial" w:cs="Arial"/>
                 <w:sz w:val="22"/>
-                <w:szCs w:val="22"/>
                 <w:lang w:eastAsia="en-US"/>
               </w:rPr>
               <w:t>current status</w:t>
@@ -554,7 +495,6 @@
               <w:rPr>
                 <w:rFonts w:ascii="Arial" w:eastAsia="Times New Roman" w:hAnsi="Arial" w:cs="Arial"/>
                 <w:sz w:val="22"/>
-                <w:szCs w:val="22"/>
                 <w:lang w:eastAsia="en-US"/>
               </w:rPr>
               <w:t>.</w:t>
@@ -581,7 +521,6 @@
               <w:rPr>
                 <w:rFonts w:ascii="Arial" w:eastAsia="Times New Roman" w:hAnsi="Arial" w:cs="Arial"/>
                 <w:sz w:val="22"/>
-                <w:szCs w:val="22"/>
                 <w:lang w:eastAsia="en-US"/>
               </w:rPr>
               <w:t>Requirements</w:t>
@@ -606,7 +545,6 @@
               <w:rPr>
                 <w:rFonts w:ascii="Arial" w:eastAsia="Times New Roman" w:hAnsi="Arial" w:cs="Arial"/>
                 <w:sz w:val="22"/>
-                <w:szCs w:val="22"/>
                 <w:lang w:eastAsia="en-US"/>
               </w:rPr>
               <w:t>N/A</w:t>
@@ -637,7 +575,6 @@
               <w:rPr>
                 <w:rFonts w:ascii="Arial" w:eastAsia="Times New Roman" w:hAnsi="Arial" w:cs="Arial"/>
                 <w:sz w:val="22"/>
-                <w:szCs w:val="22"/>
                 <w:lang w:eastAsia="en-US"/>
               </w:rPr>
               <w:t>Elements</w:t>
@@ -798,7 +735,6 @@
               <w:rPr>
                 <w:rFonts w:ascii="Arial" w:eastAsia="Times New Roman" w:hAnsi="Arial" w:cs="Arial"/>
                 <w:sz w:val="22"/>
-                <w:szCs w:val="22"/>
                 <w:lang w:eastAsia="en-US"/>
               </w:rPr>
               <w:t>Inputs</w:t>
@@ -841,7 +777,6 @@
               <w:rPr>
                 <w:rFonts w:ascii="Arial" w:eastAsia="Times New Roman" w:hAnsi="Arial" w:cs="Arial"/>
                 <w:sz w:val="22"/>
-                <w:szCs w:val="22"/>
                 <w:lang w:eastAsia="en-US"/>
               </w:rPr>
               <w:t>Outputs</w:t>
@@ -887,7 +822,6 @@
               <w:rPr>
                 <w:rFonts w:ascii="Arial" w:eastAsia="Times New Roman" w:hAnsi="Arial" w:cs="Arial"/>
                 <w:sz w:val="22"/>
-                <w:szCs w:val="22"/>
                 <w:lang w:eastAsia="en-US"/>
               </w:rPr>
               <w:t>Navigation / References</w:t>
@@ -930,7 +864,6 @@
               <w:rPr>
                 <w:rFonts w:ascii="Arial" w:eastAsia="Times New Roman" w:hAnsi="Arial" w:cs="Arial"/>
                 <w:sz w:val="22"/>
-                <w:szCs w:val="22"/>
                 <w:lang w:eastAsia="en-US"/>
               </w:rPr>
               <w:t>Viewpoint</w:t>
@@ -955,7 +888,6 @@
               <w:rPr>
                 <w:rFonts w:ascii="Arial" w:eastAsia="Times New Roman" w:hAnsi="Arial" w:cs="Arial"/>
                 <w:sz w:val="22"/>
-                <w:szCs w:val="22"/>
                 <w:lang w:eastAsia="en-US"/>
               </w:rPr>
               <w:t>UI Wireframe / Mockup (Desktop &amp; Mobile)</w:t>
@@ -1587,7 +1519,6 @@
   <w:style w:type="character" w:default="1" w:styleId="DefaultParagraphFont">
     <w:name w:val="Default Paragraph Font"/>
     <w:uiPriority w:val="1"/>
-    <w:semiHidden/>
     <w:unhideWhenUsed/>
   </w:style>
   <w:style w:type="table" w:default="1" w:styleId="TableNormal">

</xml_diff>